<commit_message>
Auftragsbestätigungs-Vorlage aktualisieren: Zahlungsbedingungen ergänzt
</commit_message>
<xml_diff>
--- a/public/downloads/auftragsbestaetigung.docx
+++ b/public/downloads/auftragsbestaetigung.docx
@@ -1431,6 +1431,19 @@
           <w:tcPr>
             <w:tcW w:w="9062" w:type="dxa"/>
           </w:tcPr>
+          <w:p>
+            <w:pPr>
+              <w:rPr>
+                <w:rFonts w:ascii="Arial" w:hAnsi="Arial" w:cs="Arial"/>
+              </w:rPr>
+            </w:pPr>
+            <w:r>
+              <w:rPr>
+                <w:rFonts w:ascii="Arial" w:hAnsi="Arial" w:cs="Arial"/>
+              </w:rPr>
+              <w:t>Zahlbar innerhalb 8 Tagen nach Rechnungserhalt ohne Abzug.</w:t>
+            </w:r>
+          </w:p>
           <w:p>
             <w:pPr>
               <w:rPr>
@@ -2041,7 +2054,27 @@
               <w:sz w:val="16"/>
               <w:szCs w:val="16"/>
             </w:rPr>
-            <w:t xml:space="preserve"> USt-IdNr. </w:t>
+            <w:t xml:space="preserve"> USt-</w:t>
+          </w:r>
+          <w:proofErr w:type="spellStart"/>
+          <w:r>
+            <w:rPr>
+              <w:rFonts w:ascii="Arial" w:hAnsi="Arial" w:cs="Arial"/>
+              <w:color w:val="808080" w:themeColor="background1" w:themeShade="80"/>
+              <w:sz w:val="16"/>
+              <w:szCs w:val="16"/>
+            </w:rPr>
+            <w:t>IdNr</w:t>
+          </w:r>
+          <w:proofErr w:type="spellEnd"/>
+          <w:r>
+            <w:rPr>
+              <w:rFonts w:ascii="Arial" w:hAnsi="Arial" w:cs="Arial"/>
+              <w:color w:val="808080" w:themeColor="background1" w:themeShade="80"/>
+              <w:sz w:val="16"/>
+              <w:szCs w:val="16"/>
+            </w:rPr>
+            <w:t xml:space="preserve">. </w:t>
           </w:r>
           <w:r>
             <w:rPr>
@@ -2124,6 +2157,7 @@
         <w:dataBinding w:prefixMappings="xmlns:ns0='http://schemas.openxmlformats.org/package/2006/metadata/core-properties' xmlns:ns1='http://purl.org/dc/elements/1.1/'" w:xpath="/ns0:coreProperties[1]/ns1:title[1]" w:storeItemID="{6C3C8BC8-F283-45AE-878A-BAB7291924A1}"/>
         <w:text/>
       </w:sdtPr>
+      <w:sdtEndPr/>
       <w:sdtContent>
         <w:r>
           <w:rPr>
@@ -2976,6 +3010,8 @@
     <w:rsid w:val="00B34DEF"/>
     <w:rsid w:val="00BA7E46"/>
     <w:rsid w:val="00BF2867"/>
+    <w:rsid w:val="00C33220"/>
+    <w:rsid w:val="00E93BAC"/>
     <w:rsid w:val="00F30B8B"/>
   </w:rsids>
   <m:mathPr>
@@ -3427,10 +3463,6 @@
     <w:semiHidden/>
     <w:unhideWhenUsed/>
   </w:style>
-  <w:style w:type="paragraph" w:customStyle="1" w:styleId="E1D331011CB946D280C8D835C6ECC812">
-    <w:name w:val="E1D331011CB946D280C8D835C6ECC812"/>
-    <w:rsid w:val="00B17F53"/>
-  </w:style>
   <w:style w:type="paragraph" w:customStyle="1" w:styleId="73EC5EC4C33F4E01A3FB2B2C490F0343">
     <w:name w:val="73EC5EC4C33F4E01A3FB2B2C490F0343"/>
     <w:rsid w:val="00626A3C"/>

</xml_diff>